<commit_message>
Renumber prompts in AI notes
</commit_message>
<xml_diff>
--- a/AI_notes.docx
+++ b/AI_notes.docx
@@ -1,6 +1,6 @@
 
 <file path=word/document.xml><?xml version="1.0" encoding="utf-8"?>
-<w:document xmlns:wpc="http://schemas.microsoft.com/office/word/2010/wordprocessingCanvas" xmlns:mo="http://schemas.microsoft.com/office/mac/office/2008/main" xmlns:mc="http://schemas.openxmlformats.org/markup-compatibility/2006" xmlns:mv="urn:schemas-microsoft-com:mac:vml" xmlns:o="urn:schemas-microsoft-com:office:office" xmlns:r="http://schemas.openxmlformats.org/officeDocument/2006/relationships" xmlns:m="http://schemas.openxmlformats.org/officeDocument/2006/math" xmlns:v="urn:schemas-microsoft-com:vml" xmlns:wp14="http://schemas.microsoft.com/office/word/2010/wordprocessingDrawing" xmlns:wp="http://schemas.openxmlformats.org/drawingml/2006/wordprocessingDrawing" xmlns:w10="urn:schemas-microsoft-com:office:word" xmlns:w="http://schemas.openxmlformats.org/wordprocessingml/2006/main" xmlns:w14="http://schemas.microsoft.com/office/word/2010/wordml" xmlns:wpg="http://schemas.microsoft.com/office/word/2010/wordprocessingGroup" xmlns:wpi="http://schemas.microsoft.com/office/word/2010/wordprocessingInk" xmlns:wne="http://schemas.microsoft.com/office/word/2006/wordml" xmlns:wps="http://schemas.microsoft.com/office/word/2010/wordprocessingShape" mc:Ignorable="w14 wp14">
+<w:document xmlns:ns1="http://schemas.openxmlformats.org/markup-compatibility/2006" xmlns:ns2="http://schemas.openxmlformats.org/officeDocument/2006/relationships" xmlns:w="http://schemas.openxmlformats.org/wordprocessingml/2006/main" ns1:Ignorable="w14 wp14">
   <w:body>
     <w:p>
       <w:pPr>
@@ -81,10 +81,10 @@
         <w:rPr>
           <w:b/>
         </w:rPr>
-        <w:t xml:space="preserve">Prompt 5 — Complete frontend integration. </w:t>
+        <w:t xml:space="preserve">Prompt 4 — Complete frontend integration. Requested a fully connected React user experience, including safety states, review controls, live updates and actual API integration.</w:t>
       </w:r>
       <w:r>
-        <w:t>Requested a fully connected React user experience, including safety states, review controls, live updates and actual API integration.</w:t>
+        <w:t/>
       </w:r>
     </w:p>
     <w:p>
@@ -123,12 +123,12 @@
     </w:p>
     <w:p>
       <w:r>
-        <w:t>The four selected prompts show the main engineering decisions: architecture → critical review → implementation discipline → frontend completion. I omitted Prompt 4 from the appendix because it repeats the general audit objective rather than capturing a distinct design or implementation decision.</w:t>
+        <w:t>The four selected prompts show the main engineering decisions: architecture → critical review → implementation discipline → frontend completion.</w:t>
       </w:r>
     </w:p>
     <w:p>
       <w:r>
-        <w:t>Original prompt wording is preserved in the appendix. Prompt 1 comes from the supplied architecture prompt; Prompts 2 and 3 from the provided prompt record; Prompt 5 from the shared frontend-completion instruction.</w:t>
+        <w:t>Original prompt wording is preserved in the appendix. Prompt 1 comes from the supplied architecture prompt; Prompts 2 and 3 from the provided prompt record; Prompt 4 from the shared frontend-completion instruction.</w:t>
       </w:r>
     </w:p>
     <w:p>
@@ -2144,7 +2144,7 @@
         <w:pStyle w:val="Heading1"/>
       </w:pPr>
       <w:r>
-        <w:t>Prompt 5 — Frontend and backend integration</w:t>
+        <w:t>Prompt 4 — Frontend and backend integration</w:t>
       </w:r>
     </w:p>
     <w:p>
@@ -2688,7 +2688,7 @@
       </w:r>
     </w:p>
     <w:sectPr>
-      <w:footerReference w:type="default" r:id="rId9"/>
+      <w:footerReference w:type="default" ns2:id="rId9"/>
       <w:pgSz w:w="12240" w:h="15840"/>
       <w:pgMar w:top="1037" w:right="1800" w:bottom="1008" w:left="1800" w:header="576" w:footer="648" w:gutter="0"/>
       <w:cols w:space="720"/>

</xml_diff>